<commit_message>
Swap jargon 'rail' -> 'system' across Mara deck, memo, and runbook
Co-Authored-By: Claude Opus 4.8 <noreply@anthropic.com>
</commit_message>
<xml_diff>
--- a/Cleared_live_Next_Steps.docx
+++ b/Cleared_live_Next_Steps.docx
@@ -159,7 +159,7 @@
           <w:sz w:val="22"/>
           <w:szCs w:val="22"/>
         </w:rPr>
-        <w:t xml:space="preserve">one rail, two modes.</w:t>
+        <w:t xml:space="preserve">one system, two modes.</w:t>
       </w:r>
       <w:r>
         <w:rPr>
@@ -211,7 +211,7 @@
           <w:sz w:val="22"/>
           <w:szCs w:val="22"/>
         </w:rPr>
-        <w:t xml:space="preserve">same rail</w:t>
+        <w:t xml:space="preserve">same system</w:t>
       </w:r>
       <w:r>
         <w:rPr>
@@ -804,7 +804,7 @@
           <w:sz w:val="22"/>
           <w:szCs w:val="22"/>
         </w:rPr>
-        <w:t xml:space="preserve">. It’s a relationship conversation, not a cold sell: “We built the rail for label waivers — let us run your next handful of requests through it so you can see it.” Free pilot, no contract. When their team sees inbound requests arrive verified, with an AI-drafted conditional waiver instead of an inconsistent email pile, the contract talks itself into existence. A first label deal — on the order of </w:t>
+        <w:t xml:space="preserve">. It’s a relationship conversation, not a cold sell: “We built the system for label waivers — let us run your next handful of requests through it so you can see it.” Free pilot, no contract. When their team sees inbound requests arrive verified, with an AI-drafted conditional waiver instead of an inconsistent email pile, the contract talks itself into existence. A first label deal — on the order of </w:t>
       </w:r>
       <w:r>
         <w:rPr>
@@ -946,7 +946,7 @@
           <w:sz w:val="22"/>
           <w:szCs w:val="22"/>
         </w:rPr>
-        <w:t xml:space="preserve"> More platforms (YouTube is the most tractable after Amazon — massive live volume, lean legal team; Netflix and HBO move slower; Hulu is mid-size and deals-hungry) and more labels (Sony, Warner) on the same rail.</w:t>
+        <w:t xml:space="preserve"> More platforms (YouTube is the most tractable after Amazon — massive live volume, lean legal team; Netflix and HBO move slower; Hulu is mid-size and deals-hungry) and more labels (Sony, Warner) on the same system.</w:t>
       </w:r>
     </w:p>
     <w:p>

</xml_diff>